<commit_message>
Add bibliography section to thesis Word document
Co-authored-by: Wail Bouymaj <wailbouymaj@gmail.com>
</commit_message>
<xml_diff>
--- a/Section_4_cessation_temporaire_notes.docx
+++ b/Section_4_cessation_temporaire_notes.docx
@@ -12,10 +12,7 @@
     </w:p>
     <w:p>
       <w:r>
-        <w:t xml:space="preserve">L'introduction, par la loi de finances 2018, d'un mécanisme de cessation temporaire d'activité traduit une inflexion pragmatique du droit fiscal marocain face à la vulnérabilité conjoncturelle des entreprises. </w:t>
-      </w:r>
-      <w:r>
-        <w:t>En permettant, sous conditions, un allègement partiel des obligations déclaratives et de certaines charges fiscales, l'article 150 bis du CGI reconnaît qu'une entreprise en tension de trésorerie ne peut être traitée comme un contribuable ordinaire sans risque d'aggraver sa défaillance.</w:t>
+        <w:t>L'introduction, par la loi de finances 2018, d'un mécanisme de cessation temporaire d'activité traduit une inflexion pragmatique du droit fiscal marocain face à la vulnérabilité conjoncturelle des entreprises. En permettant, sous conditions, un allègement partiel des obligations déclaratives et de certaines charges fiscales, l'article 150 bis du CGI reconnaît qu'une entreprise en tension de trésorerie ne peut être traitée comme un contribuable ordinaire sans risque d'aggraver sa défaillance.</w:t>
       </w:r>
       <w:r>
         <w:rPr>
@@ -37,10 +34,7 @@
     </w:p>
     <w:p>
       <w:r>
-        <w:t xml:space="preserve">Sur le plan économique, ce mécanisme présente un mérite réel : il réduit le coût fiscal fixe pesant sur des structures temporairement inactives et limite l'effet procyclique de la contrainte fiscale en phase de fragilité. </w:t>
-      </w:r>
-      <w:r>
-        <w:t>En pratique, les commentaires administratifs et les compilations du CGI confirment un soulagement ciblé (notamment sur la cotisation minimale) tout en maintenant un noyau d'obligations déclaratives.</w:t>
+        <w:t>Sur le plan économique, ce mécanisme présente un mérite réel : il réduit le coût fiscal fixe pesant sur des structures temporairement inactives et limite l'effet procyclique de la contrainte fiscale en phase de fragilité. En pratique, les commentaires administratifs et les compilations du CGI confirment un soulagement ciblé (notamment sur la cotisation minimale) tout en maintenant un noyau d'obligations déclaratives.</w:t>
       </w:r>
       <w:r>
         <w:rPr>
@@ -51,10 +45,7 @@
     </w:p>
     <w:p>
       <w:r>
-        <w:t xml:space="preserve">Cependant, ce compromis demeure étroit. D'abord, la cessation temporaire d'activité reste un outil de gestion déclarative, non un véritable instrument de restructuration du passif fiscal. </w:t>
-      </w:r>
-      <w:r>
-        <w:t>Elle n'organise ni rééchelonnement systémique de la dette fiscale, ni articulation automatique avec les procédures de prévention ou de traitement judiciaire.</w:t>
+        <w:t>Cependant, ce compromis demeure étroit. D'abord, la cessation temporaire d'activité reste un outil de gestion déclarative, non un véritable instrument de restructuration du passif fiscal. Elle n'organise ni rééchelonnement systémique de la dette fiscale, ni articulation automatique avec les procédures de prévention ou de traitement judiciaire.</w:t>
       </w:r>
       <w:r>
         <w:rPr>
@@ -76,10 +67,7 @@
     </w:p>
     <w:p>
       <w:r>
-        <w:t xml:space="preserve">Cette limite renvoie à une tension structurelle : le droit fiscal est gouverné par l'impératif de recouvrement, tandis que le droit des entreprises en difficulté poursuit la préservation de la valeur productive (emploi, actif immatériel, chaînes de paiement). </w:t>
-      </w:r>
-      <w:r>
-        <w:t>Lorsque ces deux rationalités ne sont pas synchronisées, l'administration fiscale peut devenir un facteur d'accélération de la défaillance.</w:t>
+        <w:t>Cette limite renvoie à une tension structurelle : le droit fiscal est gouverné par l'impératif de recouvrement, tandis que le droit des entreprises en difficulté poursuit la préservation de la valeur productive (emploi, actif immatériel, chaînes de paiement). Lorsque ces deux rationalités ne sont pas synchronisées, l'administration fiscale peut devenir un facteur d'accélération de la défaillance.</w:t>
       </w:r>
       <w:r>
         <w:rPr>
@@ -145,16 +133,114 @@
     </w:p>
     <w:p>
       <w:r>
-        <w:t xml:space="preserve">En définitive, le dispositif marocain de cessation temporaire d'activité constitue une innovation utile, mais encore périphérique au regard des besoins systémiques des entreprises en difficulté. </w:t>
-      </w:r>
-      <w:r>
-        <w:t>L'enjeu doctrinal est de passer d'un aménagement déclaratif ponctuel à une ingénierie de viabilité, où le recouvrement fiscal s'inscrit dans le temps long de la survie de l'entreprise.</w:t>
+        <w:t>En définitive, le dispositif marocain de cessation temporaire d'activité constitue une innovation utile, mais encore périphérique au regard des besoins systémiques des entreprises en difficulté. L'enjeu doctrinal est de passer d'un aménagement déclaratif ponctuel à une ingénierie de viabilité, où le recouvrement fiscal s'inscrit dans le temps long de la survie de l'entreprise.</w:t>
       </w:r>
       <w:r>
         <w:rPr>
           <w:rStyle w:val="FootnoteReference"/>
         </w:rPr>
         <w:footnoteReference w:id="12"/>
+      </w:r>
+    </w:p>
+    <w:p>
+      <w:r>
+        <w:br w:type="page"/>
+      </w:r>
+    </w:p>
+    <w:p>
+      <w:pPr>
+        <w:pStyle w:val="Heading1"/>
+      </w:pPr>
+      <w:r>
+        <w:t>Références bibliographiques</w:t>
+      </w:r>
+    </w:p>
+    <w:p>
+      <w:pPr>
+        <w:pStyle w:val="ListParagraph"/>
+      </w:pPr>
+      <w:r>
+        <w:t>Abassi, M. (2023). La protection du Trésor dans les systèmes des procédures collectives marocain et OHADA : approche prospective avec référence au droit français et aux autres droits européens (Thèse de doctorat, Université Lyon 3). https://theses.fr/2023LYO30013</w:t>
+      </w:r>
+    </w:p>
+    <w:p>
+      <w:pPr>
+        <w:pStyle w:val="ListParagraph"/>
+      </w:pPr>
+      <w:r>
+        <w:t>Allaki, H. (2022). Le traitement des difficultés de l'entreprise selon la loi marocaine 73-17 à la lumière du droit comparé (Thèse de doctorat, Université de Perpignan). https://theses.fr/2022PERP0029</w:t>
+      </w:r>
+    </w:p>
+    <w:p>
+      <w:pPr>
+        <w:pStyle w:val="ListParagraph"/>
+      </w:pPr>
+      <w:r>
+        <w:t>Chraibi, A. (2018). Le redressement des entreprises en difficulté au Maroc : état actuel et perspectives de réforme à la lumière du droit français (Thèse de doctorat, Aix-Marseille Université / Université Sidi Mohamed ben Abdellah de Fès). https://theses.fr/2018AIXM0121</w:t>
+      </w:r>
+    </w:p>
+    <w:p>
+      <w:pPr>
+        <w:pStyle w:val="ListParagraph"/>
+      </w:pPr>
+      <w:r>
+        <w:t>Lyazami, N. (2013). La prévention des difficultés des entreprises : étude comparative entre le droit français et le droit marocain (Thèse de doctorat, Université de Toulon). https://theses.fr/2013TOUL0073</w:t>
+      </w:r>
+    </w:p>
+    <w:p>
+      <w:pPr>
+        <w:pStyle w:val="ListParagraph"/>
+      </w:pPr>
+      <w:r>
+        <w:t>Royaume du Maroc. (2018). Loi n° 73-17 modifiant et complétant la loi n° 15-95 formant Code de commerce (Livre V), Bulletin Officiel n° 6667 du 23 avril 2018.</w:t>
+      </w:r>
+    </w:p>
+    <w:p>
+      <w:pPr>
+        <w:pStyle w:val="ListParagraph"/>
+      </w:pPr>
+      <w:r>
+        <w:t>Royaume du Maroc, Direction Générale des Impôts. Code général des impôts (éditions consolidées, incluant l'article 150 bis). https://www.tax.gov.ma</w:t>
+      </w:r>
+    </w:p>
+    <w:p>
+      <w:pPr>
+        <w:pStyle w:val="ListParagraph"/>
+      </w:pPr>
+      <w:r>
+        <w:t>UNCITRAL. (2004-2021). Legislative Guide on Insolvency Law (Parts I-V). https://uncitral.un.org/en/texts/insolvency/legislativeguides/insolvency_law</w:t>
+      </w:r>
+    </w:p>
+    <w:p>
+      <w:pPr>
+        <w:pStyle w:val="ListParagraph"/>
+      </w:pPr>
+      <w:r>
+        <w:t>World Bank. (2021). Principles for Effective Insolvency and Creditor/Debtor Regimes (Revised edition). https://documents.worldbank.org/en/publication/documents-reports/documentdetail/391341619072648570/principles-for-effective-insolvency-and-creditor-and-debtor-regimes</w:t>
+      </w:r>
+    </w:p>
+    <w:p>
+      <w:pPr>
+        <w:pStyle w:val="ListParagraph"/>
+      </w:pPr>
+      <w:r>
+        <w:t>République française. Code général des impôts, article 238 quindecies (version en vigueur).</w:t>
+      </w:r>
+    </w:p>
+    <w:p>
+      <w:pPr>
+        <w:pStyle w:val="ListParagraph"/>
+      </w:pPr>
+      <w:r>
+        <w:t>République tunisienne, DGELF. (2007). Note commune n° 33/2007 relative à l'encouragement de la transmission des entreprises.</w:t>
+      </w:r>
+    </w:p>
+    <w:p>
+      <w:pPr>
+        <w:pStyle w:val="ListParagraph"/>
+      </w:pPr>
+      <w:r>
+        <w:t>République arabe d'Égypte. (2018). Law No. 11 of 2018 Regulating Restructuring, Preventive Composition and Bankruptcy.</w:t>
       </w:r>
     </w:p>
     <w:sectPr>
@@ -205,7 +291,7 @@
         <w:footnoteRef/>
       </w:r>
       <w:r>
-        <w:t> Royaume du Maroc, loi n° 73-17 modifiant et complétant la loi n° 15-95 formant Code de commerce (Livre V), BO n° 6667, 23 avril 2018 ; voir aussi Allaki, H. (2022).</w:t>
+        <w:t> Royaume du Maroc, loi n° 73-17 modifiant et complétant la loi n° 15-95 formant Code de commerce (Livre V), BO n° 6667, 23 avril 2018 ; voir aussi Allaki (2022).</w:t>
       </w:r>
     </w:p>
   </w:footnote>
@@ -231,7 +317,7 @@
         <w:footnoteRef/>
       </w:r>
       <w:r>
-        <w:t> Chraibi, A. (2018). Le redressement des entreprises en difficulté au Maroc : état actuel et perspectives de réforme à la lumière du droit français (Thèse de doctorat).</w:t>
+        <w:t> Chraibi (2018), op. cit.</w:t>
       </w:r>
     </w:p>
   </w:footnote>
@@ -244,7 +330,7 @@
         <w:footnoteRef/>
       </w:r>
       <w:r>
-        <w:t> Lyazami, N. (2013). La prévention des difficultés des entreprises : étude comparative entre le droit français et le droit marocain (Thèse de doctorat).</w:t>
+        <w:t> Lyazami (2013), op. cit.</w:t>
       </w:r>
     </w:p>
   </w:footnote>
@@ -257,7 +343,7 @@
         <w:footnoteRef/>
       </w:r>
       <w:r>
-        <w:t> Analyse doctrinale convergente sur la tension entre recouvrement fiscal et sauvegarde de l'entreprise dans les droits contemporains de l'insolvabilité.</w:t>
+        <w:t> Pour une lecture doctrinale de cette tension, voir notamment les travaux de droit comparé cités dans la bibliographie.</w:t>
       </w:r>
     </w:p>
   </w:footnote>
@@ -270,7 +356,7 @@
         <w:footnoteRef/>
       </w:r>
       <w:r>
-        <w:t> Abassi, M. (2023). La protection du Trésor dans les systèmes des procédures collectives marocain et OHADA (Thèse de doctorat).</w:t>
+        <w:t> Abassi (2023), op. cit.</w:t>
       </w:r>
     </w:p>
   </w:footnote>
@@ -283,7 +369,7 @@
         <w:footnoteRef/>
       </w:r>
       <w:r>
-        <w:t> World Bank. (2021). Principles for Effective Insolvency and Creditor/Debtor Regimes (revised edition).</w:t>
+        <w:t> World Bank (2021), Principles for Effective Insolvency and Creditor/Debtor Regimes.</w:t>
       </w:r>
     </w:p>
   </w:footnote>
@@ -296,7 +382,7 @@
         <w:footnoteRef/>
       </w:r>
       <w:r>
-        <w:t> UNCITRAL. (2004-2021). Legislative Guide on Insolvency Law (Parts I-V).</w:t>
+        <w:t> UNCITRAL (2004-2021), Legislative Guide on Insolvency Law.</w:t>
       </w:r>
     </w:p>
   </w:footnote>
@@ -309,7 +395,7 @@
         <w:footnoteRef/>
       </w:r>
       <w:r>
-        <w:t> France : CGI, art. 238 quindecies (transmission d'entreprise). Tunisie : DGELF, note commune n° 33/2007. Égypte : Law No. 11 of 2018 on Restructuring, Preventive Composition and Bankruptcy.</w:t>
+        <w:t> France : CGI, art. 238 quindecies ; Tunisie : DGELF, note commune n° 33/2007 ; Égypte : Law No. 11 of 2018.</w:t>
       </w:r>
     </w:p>
   </w:footnote>
@@ -322,7 +408,7 @@
         <w:footnoteRef/>
       </w:r>
       <w:r>
-        <w:t> La comparaison est ici analytique et limitée : elle vise l'intelligibilité des choix normatifs marocains, sans prétendre à une transposition mécanique.</w:t>
+        <w:t> Comparaison de portée limitée, mobilisée uniquement pour éclairer les choix normatifs marocains.</w:t>
       </w:r>
     </w:p>
   </w:footnote>
@@ -335,7 +421,7 @@
         <w:footnoteRef/>
       </w:r>
       <w:r>
-        <w:t> Perspective de réforme : renforcer l'articulation entre administration fiscale, juridictions commerciales et instruments de restructuration pour préserver la continuité économique.</w:t>
+        <w:t> Proposition doctrinale de coordination fiscale et commerciale en matière de traitement des entreprises en difficulté.</w:t>
       </w:r>
     </w:p>
   </w:footnote>

</xml_diff>

<commit_message>
Add paginated footnotes to thesis Word document
Co-authored-by: Wail Bouymaj <wailbouymaj@gmail.com>
</commit_message>
<xml_diff>
--- a/Section_4_cessation_temporaire_notes.docx
+++ b/Section_4_cessation_temporaire_notes.docx
@@ -23,7 +23,7 @@
     </w:p>
     <w:p>
       <w:r>
-        <w:t>Cette logique rejoint, au moins dans son intention, le mouvement plus large de modernisation du droit des entreprises en difficulté engagé par la réforme du Livre V du Code de commerce (loi n° 73-17), centrée sur l'anticipation, la sauvegarde et la continuité de l'activité.</w:t>
+        <w:t>Sur le plan économique, ce mécanisme présente un mérite réel : il réduit le coût fiscal fixe pesant sur des structures temporairement inactives et limite l'effet procyclique de la contrainte fiscale en phase de fragilité. En pratique, l'allègement porte notamment sur la cotisation minimale, tandis qu'un noyau d'obligations déclaratives demeure.</w:t>
       </w:r>
       <w:r>
         <w:rPr>
@@ -34,7 +34,7 @@
     </w:p>
     <w:p>
       <w:r>
-        <w:t>Sur le plan économique, ce mécanisme présente un mérite réel : il réduit le coût fiscal fixe pesant sur des structures temporairement inactives et limite l'effet procyclique de la contrainte fiscale en phase de fragilité. En pratique, les commentaires administratifs et les compilations du CGI confirment un soulagement ciblé (notamment sur la cotisation minimale) tout en maintenant un noyau d'obligations déclaratives.</w:t>
+        <w:t>Ce compromis reste toutefois étroit. La cessation temporaire d'activité demeure un outil de gestion déclarative ; elle n'organise ni restructuration complète du passif fiscal, ni traitement global de la viabilité de l'entreprise. L'articulation avec les mécanismes de prévention et de traitement des difficultés doit donc être lue en lien avec l'architecture du Livre V du Code de commerce.</w:t>
       </w:r>
       <w:r>
         <w:rPr>
@@ -45,7 +45,7 @@
     </w:p>
     <w:p>
       <w:r>
-        <w:t>Cependant, ce compromis demeure étroit. D'abord, la cessation temporaire d'activité reste un outil de gestion déclarative, non un véritable instrument de restructuration du passif fiscal. Elle n'organise ni rééchelonnement systémique de la dette fiscale, ni articulation automatique avec les procédures de prévention ou de traitement judiciaire.</w:t>
+        <w:t>À cet égard, la logique du droit des entreprises en difficulté est orientée vers la continuité de l'exploitation et la recherche d'une solution de redressement chaque fois qu'elle est économiquement crédible. Cette finalité impose une coordination plus serrée entre administration fiscale, juridictions commerciales et acteurs du redressement.</w:t>
       </w:r>
       <w:r>
         <w:rPr>
@@ -56,7 +56,7 @@
     </w:p>
     <w:p>
       <w:r>
-        <w:t>Ensuite, le dispositif ne traite pas suffisamment la situation des entreprises qui continuent à opérer sous forte contrainte de liquidité : c'est pourtant dans cette zone grise que se joue, économiquement, la frontière entre redressement et liquidation.</w:t>
+        <w:t>La tension de fond demeure : d'un côté, l'impératif de recouvrement fiscal ; de l'autre, l'objectif de préservation de la valeur productive (emploi, actifs, relations d'affaires). En l'état, la norme fiscale marocaine sanctionne aussi les infractions liées à la cessation temporaire, ce qui confirme que l'assouplissement n'efface pas la logique de contrôle.</w:t>
       </w:r>
       <w:r>
         <w:rPr>
@@ -67,7 +67,7 @@
     </w:p>
     <w:p>
       <w:r>
-        <w:t>Cette limite renvoie à une tension structurelle : le droit fiscal est gouverné par l'impératif de recouvrement, tandis que le droit des entreprises en difficulté poursuit la préservation de la valeur productive (emploi, actif immatériel, chaînes de paiement). Lorsque ces deux rationalités ne sont pas synchronisées, l'administration fiscale peut devenir un facteur d'accélération de la défaillance.</w:t>
+        <w:t>D'un point de vue de théorie juridique, la question est donc celle de l'équilibre : comment maintenir la discipline fiscale sans provoquer une destruction prématurée de valeur ? Les standards internationaux d'insolvabilité insistent précisément sur cette recherche d'équilibre entre efficacité économique, protection des créanciers et considérations de politique publique.</w:t>
       </w:r>
       <w:r>
         <w:rPr>
@@ -78,7 +78,7 @@
     </w:p>
     <w:p>
       <w:r>
-        <w:t>Les travaux récents sur la place du Trésor dans les procédures collectives soulignent précisément la difficulté de concilier protection des créances publiques et continuité de l'entreprise, au Maroc comme dans d'autres systèmes de droit civil.</w:t>
+        <w:t>La doctrine institutionnelle récente insiste également sur la nécessité de mécanismes adaptés aux très petites et petites entreprises, dont la fragilité de trésorerie rend cruciale la simplicité procédurale, le coût réduit du traitement et l'accès rapide aux solutions de restructuration ou de sortie ordonnée.</w:t>
       </w:r>
       <w:r>
         <w:rPr>
@@ -89,7 +89,7 @@
     </w:p>
     <w:p>
       <w:r>
-        <w:t>La littérature institutionnelle internationale va dans le même sens : l'efficacité d'un régime d'insolvabilité tient moins à la sévérité des règles qu'à la qualité de la coordination entre prévention précoce, restructuration viable et traitement judiciaire efficient.</w:t>
+        <w:t>Appliquée au contexte marocain, cette grille de lecture invite à dépasser une logique de parenthèse fiscale pour construire un véritable statut fiscal de l'entreprise en difficulté, gradué selon le stade de crise (prévention, redressement, liquidation) et articulé avec les instruments du droit commercial.</w:t>
       </w:r>
       <w:r>
         <w:rPr>
@@ -100,46 +100,13 @@
     </w:p>
     <w:p>
       <w:r>
-        <w:t>Appliquée au contexte marocain, cette grille de lecture invite à dépasser une logique de simple parenthèse fiscale pour évoluer vers un véritable statut fiscal de l'entreprise en difficulté, gradué selon le stade de crise (prévention, sauvegarde, redressement, liquidation).</w:t>
+        <w:t>En définitive, la cessation temporaire d'activité constitue une innovation utile, mais encore périphérique au regard des besoins systémiques des entreprises en difficulté. La réforme prioritaire consiste à intégrer la temporalité du recouvrement fiscal dans une stratégie de viabilité de l'entreprise, afin de concilier soutenabilité budgétaire et continuité économique.</w:t>
       </w:r>
       <w:r>
         <w:rPr>
           <w:rStyle w:val="FootnoteReference"/>
         </w:rPr>
         <w:footnoteReference w:id="9"/>
-      </w:r>
-    </w:p>
-    <w:p>
-      <w:r>
-        <w:t>Une comparaison ciblée éclaire ce point sans déplacer le centre de gravité hors du Maroc : en France, des mécanismes fiscaux accompagnent certaines transmissions/restructurations d'entreprises ; en Tunisie, la doctrine administrative fiscale a, de longue date, mobilisé l'incitation à la transmission ; en Égypte, la loi n° 11 de 2018 a consolidé le triptyque restructuration-concordat préventif-faillite.</w:t>
-      </w:r>
-      <w:r>
-        <w:rPr>
-          <w:rStyle w:val="FootnoteReference"/>
-        </w:rPr>
-        <w:footnoteReference w:id="10"/>
-      </w:r>
-    </w:p>
-    <w:p>
-      <w:r>
-        <w:t>Ces expériences demeurent non transposables à l'identique, mais elles confirment qu'une fiscalité de crise performante exige une articulation explicite avec les outils de traitement des difficultés et une gouvernance administrative cohérente.</w:t>
-      </w:r>
-      <w:r>
-        <w:rPr>
-          <w:rStyle w:val="FootnoteReference"/>
-        </w:rPr>
-        <w:footnoteReference w:id="11"/>
-      </w:r>
-    </w:p>
-    <w:p>
-      <w:r>
-        <w:t>En définitive, le dispositif marocain de cessation temporaire d'activité constitue une innovation utile, mais encore périphérique au regard des besoins systémiques des entreprises en difficulté. L'enjeu doctrinal est de passer d'un aménagement déclaratif ponctuel à une ingénierie de viabilité, où le recouvrement fiscal s'inscrit dans le temps long de la survie de l'entreprise.</w:t>
-      </w:r>
-      <w:r>
-        <w:rPr>
-          <w:rStyle w:val="FootnoteReference"/>
-        </w:rPr>
-        <w:footnoteReference w:id="12"/>
       </w:r>
     </w:p>
     <w:p>
@@ -160,7 +127,7 @@
         <w:pStyle w:val="ListParagraph"/>
       </w:pPr>
       <w:r>
-        <w:t>Abassi, M. (2023). La protection du Trésor dans les systèmes des procédures collectives marocain et OHADA : approche prospective avec référence au droit français et aux autres droits européens (Thèse de doctorat, Université Lyon 3). https://theses.fr/2023LYO30013</w:t>
+        <w:t>Royaume du Maroc, Direction Générale des Impôts. (2024). Code général des impôts (édition 2024 consolidée). PDF exploité : CGI2024FR.pdf.</w:t>
       </w:r>
     </w:p>
     <w:p>
@@ -168,7 +135,7 @@
         <w:pStyle w:val="ListParagraph"/>
       </w:pPr>
       <w:r>
-        <w:t>Allaki, H. (2022). Le traitement des difficultés de l'entreprise selon la loi marocaine 73-17 à la lumière du droit comparé (Thèse de doctorat, Université de Perpignan). https://theses.fr/2022PERP0029</w:t>
+        <w:t>Royaume du Maroc. (1996, mod.). Code de commerce (Livre V - difficultés de l'entreprise), édition PDF consolidée consultée.</w:t>
       </w:r>
     </w:p>
     <w:p>
@@ -176,7 +143,7 @@
         <w:pStyle w:val="ListParagraph"/>
       </w:pPr>
       <w:r>
-        <w:t>Chraibi, A. (2018). Le redressement des entreprises en difficulté au Maroc : état actuel et perspectives de réforme à la lumière du droit français (Thèse de doctorat, Aix-Marseille Université / Université Sidi Mohamed ben Abdellah de Fès). https://theses.fr/2018AIXM0121</w:t>
+        <w:t>UNCITRAL. (2005). Legislative Guide on Insolvency Law (United Nations publication, 05-80722).</w:t>
       </w:r>
     </w:p>
     <w:p>
@@ -184,63 +151,7 @@
         <w:pStyle w:val="ListParagraph"/>
       </w:pPr>
       <w:r>
-        <w:t>Lyazami, N. (2013). La prévention des difficultés des entreprises : étude comparative entre le droit français et le droit marocain (Thèse de doctorat, Université de Toulon). https://theses.fr/2013TOUL0073</w:t>
-      </w:r>
-    </w:p>
-    <w:p>
-      <w:pPr>
-        <w:pStyle w:val="ListParagraph"/>
-      </w:pPr>
-      <w:r>
-        <w:t>Royaume du Maroc. (2018). Loi n° 73-17 modifiant et complétant la loi n° 15-95 formant Code de commerce (Livre V), Bulletin Officiel n° 6667 du 23 avril 2018.</w:t>
-      </w:r>
-    </w:p>
-    <w:p>
-      <w:pPr>
-        <w:pStyle w:val="ListParagraph"/>
-      </w:pPr>
-      <w:r>
-        <w:t>Royaume du Maroc, Direction Générale des Impôts. Code général des impôts (éditions consolidées, incluant l'article 150 bis). https://www.tax.gov.ma</w:t>
-      </w:r>
-    </w:p>
-    <w:p>
-      <w:pPr>
-        <w:pStyle w:val="ListParagraph"/>
-      </w:pPr>
-      <w:r>
-        <w:t>UNCITRAL. (2004-2021). Legislative Guide on Insolvency Law (Parts I-V). https://uncitral.un.org/en/texts/insolvency/legislativeguides/insolvency_law</w:t>
-      </w:r>
-    </w:p>
-    <w:p>
-      <w:pPr>
-        <w:pStyle w:val="ListParagraph"/>
-      </w:pPr>
-      <w:r>
-        <w:t>World Bank. (2021). Principles for Effective Insolvency and Creditor/Debtor Regimes (Revised edition). https://documents.worldbank.org/en/publication/documents-reports/documentdetail/391341619072648570/principles-for-effective-insolvency-and-creditor-and-debtor-regimes</w:t>
-      </w:r>
-    </w:p>
-    <w:p>
-      <w:pPr>
-        <w:pStyle w:val="ListParagraph"/>
-      </w:pPr>
-      <w:r>
-        <w:t>République française. Code général des impôts, article 238 quindecies (version en vigueur).</w:t>
-      </w:r>
-    </w:p>
-    <w:p>
-      <w:pPr>
-        <w:pStyle w:val="ListParagraph"/>
-      </w:pPr>
-      <w:r>
-        <w:t>République tunisienne, DGELF. (2007). Note commune n° 33/2007 relative à l'encouragement de la transmission des entreprises.</w:t>
-      </w:r>
-    </w:p>
-    <w:p>
-      <w:pPr>
-        <w:pStyle w:val="ListParagraph"/>
-      </w:pPr>
-      <w:r>
-        <w:t>République arabe d'Égypte. (2018). Law No. 11 of 2018 Regulating Restructuring, Preventive Composition and Bankruptcy.</w:t>
+        <w:t>World Bank. (2021). Principles for Effective Insolvency and Creditor/Debtor Regimes (Revised Edition).</w:t>
       </w:r>
     </w:p>
     <w:sectPr>
@@ -278,7 +189,7 @@
         <w:footnoteRef/>
       </w:r>
       <w:r>
-        <w:t> Royaume du Maroc, Code général des impôts (éd. consolidées), art. 150 bis, consultable via la Direction générale des impôts (tax.gov.ma).</w:t>
+        <w:t> Royaume du Maroc, DGI, Code général des impôts, éd. 2024, art. 150 bis, PDF p. 269 (pagination interne : p. 270).</w:t>
       </w:r>
     </w:p>
   </w:footnote>
@@ -291,7 +202,7 @@
         <w:footnoteRef/>
       </w:r>
       <w:r>
-        <w:t> Royaume du Maroc, loi n° 73-17 modifiant et complétant la loi n° 15-95 formant Code de commerce (Livre V), BO n° 6667, 23 avril 2018 ; voir aussi Allaki (2022).</w:t>
+        <w:t> Royaume du Maroc, DGI, Code général des impôts, éd. 2024, art. 144, PDF p. 256 (référence à l'art. 150 bis) ; voir aussi art. 150 bis, PDF p. 269.</w:t>
       </w:r>
     </w:p>
   </w:footnote>
@@ -304,7 +215,7 @@
         <w:footnoteRef/>
       </w:r>
       <w:r>
-        <w:t> Direction générale des impôts (Maroc), documentation fiscale et pratiques déclaratives relatives à la cessation temporaire d'activité (LF 2018 et consolidations ultérieures du CGI).</w:t>
+        <w:t> Code de commerce marocain (Livre V, difficultés de l'entreprise), Titres I-II, PDF pp. 100-102 (prévention interne/externe et ouverture).</w:t>
       </w:r>
     </w:p>
   </w:footnote>
@@ -317,7 +228,7 @@
         <w:footnoteRef/>
       </w:r>
       <w:r>
-        <w:t> Chraibi (2018), op. cit.</w:t>
+        <w:t> Code de commerce marocain (Livre V), redressement judiciaire et continuation de l'exploitation, PDF pp. 104-108 (notamment art. 571 et s.).</w:t>
       </w:r>
     </w:p>
   </w:footnote>
@@ -330,7 +241,7 @@
         <w:footnoteRef/>
       </w:r>
       <w:r>
-        <w:t> Lyazami (2013), op. cit.</w:t>
+        <w:t> Code général des impôts, éd. 2024, art. 232-VIII-17°, PDF p. 413 ; et contrôle de la période de cessation temporaire, PDF p. 380.</w:t>
       </w:r>
     </w:p>
   </w:footnote>
@@ -343,7 +254,7 @@
         <w:footnoteRef/>
       </w:r>
       <w:r>
-        <w:t> Pour une lecture doctrinale de cette tension, voir notamment les travaux de droit comparé cités dans la bibliographie.</w:t>
+        <w:t> UNCITRAL, Legislative Guide on Insolvency Law (2005), p. 15 (objet et équilibre), pp. 23-25 (objectifs et balance liquidation/réorganisation).</w:t>
       </w:r>
     </w:p>
   </w:footnote>
@@ -356,7 +267,7 @@
         <w:footnoteRef/>
       </w:r>
       <w:r>
-        <w:t> Abassi (2023), op. cit.</w:t>
+        <w:t> World Bank, Principles for Effective Insolvency and Creditor/Debtor Regimes (2021), PDF p. 5 (Background), p. 10 (flexibilité des principes), pp. 36-37 (C19-C20 sur procédures simplifiées/MSE).</w:t>
       </w:r>
     </w:p>
   </w:footnote>
@@ -369,7 +280,7 @@
         <w:footnoteRef/>
       </w:r>
       <w:r>
-        <w:t> World Bank (2021), Principles for Effective Insolvency and Creditor/Debtor Regimes.</w:t>
+        <w:t> UNCITRAL (2005), pp. 23-25 ; World Bank (2021), pp. 36-37 : convergence sur l'articulation entre efficacité, coûts procéduraux et continuité économique.</w:t>
       </w:r>
     </w:p>
   </w:footnote>
@@ -382,46 +293,7 @@
         <w:footnoteRef/>
       </w:r>
       <w:r>
-        <w:t> UNCITRAL (2004-2021), Legislative Guide on Insolvency Law.</w:t>
-      </w:r>
-    </w:p>
-  </w:footnote>
-  <w:footnote w:id="10">
-    <w:p>
-      <w:r>
-        <w:rPr>
-          <w:rStyle w:val="FootnoteReference"/>
-        </w:rPr>
-        <w:footnoteRef/>
-      </w:r>
-      <w:r>
-        <w:t> France : CGI, art. 238 quindecies ; Tunisie : DGELF, note commune n° 33/2007 ; Égypte : Law No. 11 of 2018.</w:t>
-      </w:r>
-    </w:p>
-  </w:footnote>
-  <w:footnote w:id="11">
-    <w:p>
-      <w:r>
-        <w:rPr>
-          <w:rStyle w:val="FootnoteReference"/>
-        </w:rPr>
-        <w:footnoteRef/>
-      </w:r>
-      <w:r>
-        <w:t> Comparaison de portée limitée, mobilisée uniquement pour éclairer les choix normatifs marocains.</w:t>
-      </w:r>
-    </w:p>
-  </w:footnote>
-  <w:footnote w:id="12">
-    <w:p>
-      <w:r>
-        <w:rPr>
-          <w:rStyle w:val="FootnoteReference"/>
-        </w:rPr>
-        <w:footnoteRef/>
-      </w:r>
-      <w:r>
-        <w:t> Proposition doctrinale de coordination fiscale et commerciale en matière de traitement des entreprises en difficulté.</w:t>
+        <w:t> Code de commerce marocain, PDF pp. 100-108 ; CGI 2024, PDF pp. 256, 269, 380 et 413.</w:t>
       </w:r>
     </w:p>
   </w:footnote>

</xml_diff>